<commit_message>
File Jouni Ikäheimo's letter of support
Signed, scanned 5 October, on plain paper and undated. It takes the
induction machines in Chapter 3, manufacture and tolerance control
(§13.3), qualification against international standards (§13.5), and
photographs "subject to my employer's agreement", so ABB still has to
be asked.

One overlap: the Chapter 13 invitation offered §13.3 to Jonna Tiainen
first, with an ABB colleague as the fallback, and Jouni's letter now
takes it. It is noted for settling with the chapter's owners. The
brief no longer suggests Aarniovuori for §13.5, which Jouni's letter
covers. Six of the ten letters are now back.

Co-Authored-By: Claude Opus 5.5 <noreply@anthropic.com>
Claude-Session: https://claude.ai/code/session_01YTsySEafbpGxYLQMAGUGjT
</commit_message>
<xml_diff>
--- a/chapter1/Invitation_Emails.docx
+++ b/chapter1/Invitation_Emails.docx
@@ -1113,7 +1113,47 @@
         <w:jc w:val="both"/>
       </w:pPr>
       <w:r>
-        <w:t>the sections, separates "material" from "writing", and raises the ABB clearance.*</w:t>
+        <w:t>the sections, separates "material" from "writing", and raises the ABB clearance.</w:t>
+      </w:r>
+    </w:p>
+    <w:p>
+      <w:pPr>
+        <w:jc w:val="both"/>
+      </w:pPr>
+      <w:r>
+        <w:t>Letter returned signed, in a scan dated 5 October</w:t>
+      </w:r>
+    </w:p>
+    <w:p>
+      <w:pPr>
+        <w:jc w:val="both"/>
+      </w:pPr>
+      <w:r>
+        <w:t>(`letters/received/Support_Letter_Ikaheimo_SIGNED.md`). It takes the induction machines in</w:t>
+      </w:r>
+    </w:p>
+    <w:p>
+      <w:pPr>
+        <w:jc w:val="both"/>
+      </w:pPr>
+      <w:r>
+        <w:t>Chapter 3, §13.3 and §13.5, and the photographs "subject to my employer's agreement".</w:t>
+      </w:r>
+    </w:p>
+    <w:p>
+      <w:pPr>
+        <w:jc w:val="both"/>
+      </w:pPr>
+      <w:r>
+        <w:t>§13.3 was also offered to Jonna in the Chapter 13 email, so settle it with the chapter's</w:t>
+      </w:r>
+    </w:p>
+    <w:p>
+      <w:pPr>
+        <w:jc w:val="both"/>
+      </w:pPr>
+      <w:r>
+        <w:t>owners.*</w:t>
       </w:r>
     </w:p>
     <w:p>

</xml_diff>

<commit_message>
Draft the first email to Ion Boldea, to be sent by Ilya
Ilya proposed inviting Boldea, who was the opponent at his doctoral
defence. The approach takes two steps. This first email describes the
book's scope, says that some chapters fit his expertise without naming
any, and asks whether he would like to contribute. If he says yes, the
second email offers a choice between Chapter 3 and Chapter 9, with the
boundaries stated. The notes list what to settle before then.

Co-Authored-By: Claude Opus 5.5 <noreply@anthropic.com>
Claude-Session: https://claude.ai/code/session_01YTsySEafbpGxYLQMAGUGjT
</commit_message>
<xml_diff>
--- a/chapter1/Invitation_Emails.docx
+++ b/chapter1/Invitation_Emails.docx
@@ -3164,6 +3164,253 @@
       </w:pPr>
       <w:r>
         <w:t>BR, Hüseyin</w:t>
+      </w:r>
+    </w:p>
+    <w:p>
+      <w:r>
+        <w:br w:type="page"/>
+      </w:r>
+    </w:p>
+    <w:p>
+      <w:pPr>
+        <w:pStyle w:val="Heading2"/>
+      </w:pPr>
+      <w:r>
+        <w:t>Ion Boldea — sent by Ilya Petrov</w:t>
+      </w:r>
+    </w:p>
+    <w:p>
+      <w:pPr>
+        <w:jc w:val="both"/>
+      </w:pPr>
+      <w:r>
+        <w:t>*Ilya's suggestion. Boldea was the opponent at Ilya's doctoral defence and they have kept in</w:t>
+      </w:r>
+    </w:p>
+    <w:p>
+      <w:pPr>
+        <w:jc w:val="both"/>
+      </w:pPr>
+      <w:r>
+        <w:t>touch, so Ilya writes, with Juha and Hüseyin in copy. The approach has two steps.*</w:t>
+      </w:r>
+    </w:p>
+    <w:p>
+      <w:pPr>
+        <w:pStyle w:val="ListBullet"/>
+      </w:pPr>
+      <w:r>
+        <w:t>*The first email asks only whether he would like to contribute. It says that some chapters</w:t>
+      </w:r>
+    </w:p>
+    <w:p>
+      <w:pPr>
+        <w:jc w:val="both"/>
+      </w:pPr>
+      <w:r>
+        <w:t>fit his expertise, and names none of them.*</w:t>
+      </w:r>
+    </w:p>
+    <w:p>
+      <w:pPr>
+        <w:pStyle w:val="ListBullet"/>
+      </w:pPr>
+      <w:r>
+        <w:t>*If he says yes, the second email sends Chapter 1 and the annotated table of contents. It</w:t>
+      </w:r>
+    </w:p>
+    <w:p>
+      <w:pPr>
+        <w:jc w:val="both"/>
+      </w:pPr>
+      <w:r>
+        <w:t>offers him a choice between Chapter 3 and Chapter 9, with the boundaries stated, and the</w:t>
+      </w:r>
+    </w:p>
+    <w:p>
+      <w:pPr>
+        <w:jc w:val="both"/>
+      </w:pPr>
+      <w:r>
+        <w:t>editors write whichever chapter he does not take:*</w:t>
+      </w:r>
+    </w:p>
+    <w:p>
+      <w:pPr>
+        <w:pStyle w:val="ListBullet"/>
+      </w:pPr>
+      <w:r>
+        <w:rPr>
+          <w:i/>
+        </w:rPr>
+        <w:t>Chapter 3, machine topologies. Ikäheimo writes the induction-machine section.</w:t>
+      </w:r>
+    </w:p>
+    <w:p>
+      <w:pPr>
+        <w:pStyle w:val="ListBullet"/>
+      </w:pPr>
+      <w:r>
+        <w:rPr>
+          <w:i/>
+        </w:rPr>
+        <w:t>Chapter 9, core and rotor losses. Saari writes the windage section.</w:t>
+      </w:r>
+    </w:p>
+    <w:p>
+      <w:pPr>
+        <w:pStyle w:val="Heading3"/>
+      </w:pPr>
+      <w:r>
+        <w:t>First email — draft</w:t>
+      </w:r>
+    </w:p>
+    <w:p>
+      <w:pPr>
+        <w:jc w:val="both"/>
+      </w:pPr>
+      <w:r>
+        <w:t>Subject: Wiley book proposal on high-speed electrical machines and drives</w:t>
+      </w:r>
+    </w:p>
+    <w:p>
+      <w:pPr>
+        <w:jc w:val="both"/>
+      </w:pPr>
+      <w:r>
+        <w:t>Dear Ion,</w:t>
+      </w:r>
+    </w:p>
+    <w:p>
+      <w:pPr>
+        <w:jc w:val="both"/>
+      </w:pPr>
+      <w:r>
+        <w:t xml:space="preserve">I hope you are well. Juha Pyrhönen, Hüseyin Canseven and I are preparing a book proposal to Wiley-IEEE Press on high-speed electrical machines and drives, written as a companion to </w:t>
+      </w:r>
+      <w:r>
+        <w:rPr>
+          <w:i/>
+        </w:rPr>
+        <w:t>Design of Rotating Electrical Machines</w:t>
+      </w:r>
+      <w:r>
+        <w:t>.</w:t>
+      </w:r>
+    </w:p>
+    <w:p>
+      <w:pPr>
+        <w:jc w:val="both"/>
+      </w:pPr>
+      <w:r>
+        <w:t>It is a design book. Its chapters cover the applications of high-speed machines and the choice of machine topology; rotor mechanics, rotordynamics and bearings; electromagnetic sizing; winding, core and rotor losses and thermal management; the power electronics and control; and industrial and mobile case studies.</w:t>
+      </w:r>
+    </w:p>
+    <w:p>
+      <w:pPr>
+        <w:jc w:val="both"/>
+      </w:pPr>
+      <w:r>
+        <w:t>We would be delighted if you would contribute a chapter. Some of them fit your area of expertise very closely, and if the idea interests you, we would be glad to discuss which one would suit you best.</w:t>
+      </w:r>
+    </w:p>
+    <w:p>
+      <w:pPr>
+        <w:jc w:val="both"/>
+      </w:pPr>
+      <w:r>
+        <w:t>Nothing is binding at this stage: the publisher has not yet seen the proposal, and no writing would begin before a contract is signed. If you are interested, I will send you the completed introductory chapter and the annotated table of contents.</w:t>
+      </w:r>
+    </w:p>
+    <w:p>
+      <w:pPr>
+        <w:jc w:val="both"/>
+      </w:pPr>
+      <w:r>
+        <w:t>Best regards,</w:t>
+      </w:r>
+    </w:p>
+    <w:p>
+      <w:pPr>
+        <w:jc w:val="both"/>
+      </w:pPr>
+      <w:r>
+        <w:t>Ilya</w:t>
+      </w:r>
+    </w:p>
+    <w:p>
+      <w:pPr>
+        <w:pStyle w:val="Heading3"/>
+      </w:pPr>
+      <w:r>
+        <w:t>Before the second email</w:t>
+      </w:r>
+    </w:p>
+    <w:p>
+      <w:pPr>
+        <w:jc w:val="both"/>
+      </w:pPr>
+      <w:r>
+        <w:rPr>
+          <w:i/>
+        </w:rPr>
+        <w:t>Settle the boundaries of each option.</w:t>
+      </w:r>
+    </w:p>
+    <w:p>
+      <w:pPr>
+        <w:pStyle w:val="ListBullet"/>
+      </w:pPr>
+      <w:r>
+        <w:t>*Chapter 3. Ikäheimo's signed letter covers the induction-machine section only, so the</w:t>
+      </w:r>
+    </w:p>
+    <w:p>
+      <w:pPr>
+        <w:jc w:val="both"/>
+      </w:pPr>
+      <w:r>
+        <w:t>reluctance and PM sections would be Boldea's.*</w:t>
+      </w:r>
+    </w:p>
+    <w:p>
+      <w:pPr>
+        <w:pStyle w:val="ListBullet"/>
+      </w:pPr>
+      <w:r>
+        <w:t>*Chapter 9. The table of contents gives Ilya the rotor losses, so decide whether Ilya</w:t>
+      </w:r>
+    </w:p>
+    <w:p>
+      <w:pPr>
+        <w:jc w:val="both"/>
+      </w:pPr>
+      <w:r>
+        <w:t>writes them under Boldea or Boldea takes them. Decide also who writes the materials</w:t>
+      </w:r>
+    </w:p>
+    <w:p>
+      <w:pPr>
+        <w:jc w:val="both"/>
+      </w:pPr>
+      <w:r>
+        <w:t>sections, §9.1–9.4.*</w:t>
+      </w:r>
+    </w:p>
+    <w:p>
+      <w:pPr>
+        <w:jc w:val="both"/>
+      </w:pPr>
+      <w:r>
+        <w:t>*Anouar's signed letter names Chapter 9, which under this plan goes to Boldea or to the</w:t>
+      </w:r>
+    </w:p>
+    <w:p>
+      <w:pPr>
+        <w:jc w:val="both"/>
+      </w:pPr>
+      <w:r>
+        <w:t>editors, so he needs to hear from us before the table of contents goes out.*</w:t>
       </w:r>
     </w:p>
     <w:p>

</xml_diff>

<commit_message>
Marko Hinkkanen accepts Chapter 12; draft the reply and update his letter
He wrote on 25 October that his group would be happy to take part, and
offered a letter of support. The draft reply confirms Chapter 12 and
asks for his postdoc's name and the letter by Friday 6 November. It
also says he will be put in touch with Pasi Peltoniemi after approval.

His draft letter predated the split. It now offers the chapter on
control at high fundamental frequency, written with a postdoc whose
name he fills in, and replaces "eight or ten" with Juha's "nine or
eleven". The table of contents and the letter register are updated.

Co-Authored-By: Claude Opus 5.5 <noreply@anthropic.com>
Claude-Session: https://claude.ai/code/session_01YTsySEafbpGxYLQMAGUGjT
</commit_message>
<xml_diff>
--- a/chapter1/Invitation_Emails.docx
+++ b/chapter1/Invitation_Emails.docx
@@ -2621,18 +2621,175 @@
         <w:pStyle w:val="Heading3"/>
       </w:pPr>
       <w:r>
-        <w:t>Not yet done</w:t>
-      </w:r>
-    </w:p>
-    <w:p>
-      <w:pPr>
-        <w:jc w:val="both"/>
-      </w:pPr>
-      <w:r>
-        <w:rPr>
-          <w:i/>
-        </w:rPr>
-        <w:t>Offer to put him in touch with Peltoniemi, so that Chapters 11 and 12 are planned together.</w:t>
+        <w:t>His acceptance — 25 October</w:t>
+      </w:r>
+    </w:p>
+    <w:p>
+      <w:pPr>
+        <w:jc w:val="both"/>
+      </w:pPr>
+      <w:r>
+        <w:t>&gt; Dear Hüseyin,</w:t>
+      </w:r>
+    </w:p>
+    <w:p>
+      <w:pPr>
+        <w:jc w:val="both"/>
+      </w:pPr>
+      <w:r>
+        <w:t>&gt;</w:t>
+      </w:r>
+    </w:p>
+    <w:p>
+      <w:pPr>
+        <w:jc w:val="both"/>
+      </w:pPr>
+      <w:r>
+        <w:t>&gt; My apologies for the very late reply.</w:t>
+      </w:r>
+    </w:p>
+    <w:p>
+      <w:pPr>
+        <w:jc w:val="both"/>
+      </w:pPr>
+      <w:r>
+        <w:t>&gt;</w:t>
+      </w:r>
+    </w:p>
+    <w:p>
+      <w:pPr>
+        <w:jc w:val="both"/>
+      </w:pPr>
+      <w:r>
+        <w:t>&gt; Thank you for sending the drafts and the additional information. We have reviewed the material, and we would be happy to participate in the project, if this is still possible at this stage. The topic is very interesting and fits well with our expertise.</w:t>
+      </w:r>
+    </w:p>
+    <w:p>
+      <w:pPr>
+        <w:jc w:val="both"/>
+      </w:pPr>
+      <w:r>
+        <w:t>&gt;</w:t>
+      </w:r>
+    </w:p>
+    <w:p>
+      <w:pPr>
+        <w:jc w:val="both"/>
+      </w:pPr>
+      <w:r>
+        <w:t>&gt; I can also prepare a short letter of support for the Wiley proposal, if it would still be useful. Please let me know if there is still time for this and whether you have any preferred deadline.</w:t>
+      </w:r>
+    </w:p>
+    <w:p>
+      <w:pPr>
+        <w:jc w:val="both"/>
+      </w:pPr>
+      <w:r>
+        <w:t>&gt;</w:t>
+      </w:r>
+    </w:p>
+    <w:p>
+      <w:pPr>
+        <w:jc w:val="both"/>
+      </w:pPr>
+      <w:r>
+        <w:t>&gt; Best regards,</w:t>
+      </w:r>
+    </w:p>
+    <w:p>
+      <w:pPr>
+        <w:jc w:val="both"/>
+      </w:pPr>
+      <w:r>
+        <w:t>&gt; Marko</w:t>
+      </w:r>
+    </w:p>
+    <w:p>
+      <w:pPr>
+        <w:pStyle w:val="Heading3"/>
+      </w:pPr>
+      <w:r>
+        <w:t>Our reply — draft</w:t>
+      </w:r>
+    </w:p>
+    <w:p>
+      <w:pPr>
+        <w:jc w:val="both"/>
+      </w:pPr>
+      <w:r>
+        <w:t>*Reply to all, so that Ilya and Juha stay in copy. Attach the updated</w:t>
+      </w:r>
+    </w:p>
+    <w:p>
+      <w:pPr>
+        <w:jc w:val="both"/>
+      </w:pPr>
+      <w:r>
+        <w:t>`letters/Support_Letter_Hinkkanen.docx`. The draft he already has predates the split: it</w:t>
+      </w:r>
+    </w:p>
+    <w:p>
+      <w:pPr>
+        <w:jc w:val="both"/>
+      </w:pPr>
+      <w:r>
+        <w:t>offered "the control sections of the chapter on the drive" and put the pulse ratio at "eight</w:t>
+      </w:r>
+    </w:p>
+    <w:p>
+      <w:pPr>
+        <w:jc w:val="both"/>
+      </w:pPr>
+      <w:r>
+        <w:t>or ten". The new one gives him Chapter 12, names his postdoc as a bracket for him to fill, and</w:t>
+      </w:r>
+    </w:p>
+    <w:p>
+      <w:pPr>
+        <w:jc w:val="both"/>
+      </w:pPr>
+      <w:r>
+        <w:t>uses Juha's "nine or eleven".*</w:t>
+      </w:r>
+    </w:p>
+    <w:p>
+      <w:pPr>
+        <w:jc w:val="both"/>
+      </w:pPr>
+      <w:r>
+        <w:t>Hello Marko,</w:t>
+      </w:r>
+    </w:p>
+    <w:p>
+      <w:pPr>
+        <w:jc w:val="both"/>
+      </w:pPr>
+      <w:r>
+        <w:t>Thank you, and no apology needed: this is very good news, and it is certainly not too late.</w:t>
+      </w:r>
+    </w:p>
+    <w:p>
+      <w:pPr>
+        <w:jc w:val="both"/>
+      </w:pPr>
+      <w:r>
+        <w:t>As the table of contents shows, the control side is a chapter of its own, Chapter 12, Control at high fundamental frequency, about eighteen pages, and we would be glad for it to be yours, written together with your postdoc. Could you tell us their name? Everyone who contributes is named at the head of the chapter, and naming them in the proposal makes it stronger. The chapter follows Chapter 11 on the converter, which Pasi Peltoniemi is writing at LUT; once the publisher has approved the proposal, we will put you in touch so that the two chapters are planned together.</w:t>
+      </w:r>
+    </w:p>
+    <w:p>
+      <w:pPr>
+        <w:jc w:val="both"/>
+      </w:pPr>
+      <w:r>
+        <w:t>Yes, a short letter of support would be very useful. We plan to submit the proposal in November, so could you send it by Friday 6 November? I attach an updated draft, since the one you have was written before control became a chapter of its own. As before, please rewrite it as you see fit; the details in brackets are yours to fill in.</w:t>
+      </w:r>
+    </w:p>
+    <w:p>
+      <w:pPr>
+        <w:jc w:val="both"/>
+      </w:pPr>
+      <w:r>
+        <w:t>BR, Hüseyin</w:t>
       </w:r>
     </w:p>
     <w:p>

</xml_diff>